<commit_message>
Add Linux kernel contribution and sync with the website
- resume.md: take the current text of the website's resume/index.md
  (April 2026 edits: CEO at Redstone Solutions OÜ 2021-Today,
  ML Consulting 2020-2021), with the {{ MYAGE }} placeholder restored
  in the contact line.
- Add "Linux kernel" as the first Open Source Contributions entry
  (ext2 patch 92e128884bf0, merged in Linux 2.6.33).
- style.tex: set headalign=nothyphenated on description terms. Without
  it ConTeXt hyphenates the new term in the 18mm term column as
  "Linux ker-/nel".
  The existing terms render exactly as before.
- Rebuild index.html, index.pdf, index.docx and index.txt with
  `make clean && make` (pandoc 2.7.3, the version that reproduces the
  2022 outputs, and ConTeXt MkIV on LuaTeX). The age is now filled in
  (the 2022 build ran with BSD date, which left it blank).

Co-Authored-By: Claude Opus 5.5 <noreply@anthropic.com>
</commit_message>
<xml_diff>
--- a/index.docx
+++ b/index.docx
@@ -56,6 +56,72 @@
         <w:pStyle w:val="DefinitionTerm"/>
       </w:pPr>
       <w:r>
+        <w:t xml:space="preserve">2021-Today</w:t>
+      </w:r>
+    </w:p>
+    <w:p>
+      <w:pPr>
+        <w:pStyle w:val="Definition"/>
+      </w:pPr>
+      <w:r>
+        <w:rPr>
+          <w:i/>
+        </w:rPr>
+        <w:t xml:space="preserve">CEO at Redstone Solutions OÜ</w:t>
+      </w:r>
+    </w:p>
+    <w:p>
+      <w:pPr>
+        <w:pStyle w:val="Definition"/>
+      </w:pPr>
+      <w:r>
+        <w:t xml:space="preserve">Real-time and high-availability solutions. Building advanced generative modeling and simulation technologies.</w:t>
+      </w:r>
+    </w:p>
+    <w:p>
+      <w:pPr>
+        <w:pStyle w:val="DefinitionTerm"/>
+      </w:pPr>
+      <w:r>
+        <w:t xml:space="preserve">2020-2021</w:t>
+      </w:r>
+    </w:p>
+    <w:p>
+      <w:pPr>
+        <w:pStyle w:val="Definition"/>
+      </w:pPr>
+      <w:r>
+        <w:rPr>
+          <w:i/>
+        </w:rPr>
+        <w:t xml:space="preserve">ML Consulting</w:t>
+      </w:r>
+    </w:p>
+    <w:p>
+      <w:pPr>
+        <w:pStyle w:val="Definition"/>
+      </w:pPr>
+      <w:r>
+        <w:t xml:space="preserve">Providing machine learning consulting services with a focus on time series forecasting.</w:t>
+      </w:r>
+      <w:r>
+        <w:t xml:space="preserve"> </w:t>
+      </w:r>
+      <w:r>
+        <w:t xml:space="preserve">Expertise includes designing and implementing predictive models using PyTorch, transformers,</w:t>
+      </w:r>
+      <w:r>
+        <w:t xml:space="preserve"> </w:t>
+      </w:r>
+      <w:r>
+        <w:t xml:space="preserve">and recurrent neural network architectures.</w:t>
+      </w:r>
+    </w:p>
+    <w:p>
+      <w:pPr>
+        <w:pStyle w:val="DefinitionTerm"/>
+      </w:pPr>
+      <w:r>
         <w:t xml:space="preserve">2019-2020</w:t>
       </w:r>
     </w:p>
@@ -478,6 +544,43 @@
         <w:pStyle w:val="DefinitionTerm"/>
       </w:pPr>
       <w:r>
+        <w:t xml:space="preserve">Linux kernel</w:t>
+      </w:r>
+    </w:p>
+    <w:p>
+      <w:pPr>
+        <w:pStyle w:val="Compact"/>
+        <w:pStyle w:val="Definition"/>
+      </w:pPr>
+      <w:r>
+        <w:t xml:space="preserve">Contributor to the ext2 filesystem</w:t>
+      </w:r>
+      <w:r>
+        <w:t xml:space="preserve"> </w:t>
+      </w:r>
+      <w:r>
+        <w:t xml:space="preserve">(</w:t>
+      </w:r>
+      <w:hyperlink r:id="rId23">
+        <w:r>
+          <w:rPr>
+            <w:rStyle w:val="Hyperlink"/>
+          </w:rPr>
+          <w:t xml:space="preserve">patch</w:t>
+        </w:r>
+      </w:hyperlink>
+      <w:r>
+        <w:t xml:space="preserve"> </w:t>
+      </w:r>
+      <w:r>
+        <w:t xml:space="preserve">merged in Linux 2.6.33).</w:t>
+      </w:r>
+    </w:p>
+    <w:p>
+      <w:pPr>
+        <w:pStyle w:val="DefinitionTerm"/>
+      </w:pPr>
+      <w:r>
         <w:t xml:space="preserve">C++</w:t>
       </w:r>
     </w:p>
@@ -492,7 +595,7 @@
       <w:r>
         <w:t xml:space="preserve"> </w:t>
       </w:r>
-      <w:hyperlink r:id="rId23">
+      <w:hyperlink r:id="rId24">
         <w:r>
           <w:rPr>
             <w:rStyle w:val="Hyperlink"/>
@@ -529,7 +632,7 @@
       <w:r>
         <w:t xml:space="preserve"> </w:t>
       </w:r>
-      <w:hyperlink r:id="rId24">
+      <w:hyperlink r:id="rId25">
         <w:r>
           <w:rPr>
             <w:rStyle w:val="Hyperlink"/>
@@ -551,11 +654,11 @@
       <w:pPr>
         <w:pStyle w:val="Heading2"/>
       </w:pPr>
-      <w:bookmarkStart w:id="25" w:name="techs-and-stacks"/>
+      <w:bookmarkStart w:id="26" w:name="techs-and-stacks"/>
       <w:r>
         <w:t xml:space="preserve">Techs and Stacks</w:t>
       </w:r>
-      <w:bookmarkEnd w:id="25"/>
+      <w:bookmarkEnd w:id="26"/>
     </w:p>
     <w:p>
       <w:pPr>
@@ -633,11 +736,11 @@
       <w:pPr>
         <w:pStyle w:val="Heading2"/>
       </w:pPr>
-      <w:bookmarkStart w:id="26" w:name="activities-and-interests"/>
+      <w:bookmarkStart w:id="27" w:name="activities-and-interests"/>
       <w:r>
         <w:t xml:space="preserve">Activities and interests</w:t>
       </w:r>
-      <w:bookmarkEnd w:id="26"/>
+      <w:bookmarkEnd w:id="27"/>
     </w:p>
     <w:p>
       <w:pPr>
@@ -685,7 +788,7 @@
         <w:pStyle w:val="BlockText"/>
       </w:pPr>
       <w:r>
-        <w:t xml:space="preserve">jeremy.cochoy@gmail.com • +33 6 43 01 74 02 • years old</w:t>
+        <w:t xml:space="preserve">jeremy.cochoy@gmail.com • +33 6 43 01 74 02 • 36 years old</w:t>
       </w:r>
       <w:r>
         <w:br/>
@@ -702,7 +805,7 @@
       <w:r>
         <w:br/>
       </w:r>
-      <w:hyperlink r:id="rId27">
+      <w:hyperlink r:id="rId28">
         <w:r>
           <w:rPr>
             <w:rStyle w:val="Hyperlink"/>
@@ -719,7 +822,7 @@
       <w:r>
         <w:t xml:space="preserve"> </w:t>
       </w:r>
-      <w:hyperlink r:id="rId28">
+      <w:hyperlink r:id="rId29">
         <w:r>
           <w:rPr>
             <w:rStyle w:val="Hyperlink"/>
@@ -736,7 +839,7 @@
       <w:r>
         <w:t xml:space="preserve"> </w:t>
       </w:r>
-      <w:hyperlink r:id="rId29">
+      <w:hyperlink r:id="rId30">
         <w:r>
           <w:rPr>
             <w:rStyle w:val="Hyperlink"/>
@@ -753,7 +856,7 @@
       <w:r>
         <w:t xml:space="preserve"> </w:t>
       </w:r>
-      <w:hyperlink r:id="rId30">
+      <w:hyperlink r:id="rId31">
         <w:r>
           <w:rPr>
             <w:rStyle w:val="Hyperlink"/>

</xml_diff>

<commit_message>
Resume: shorten the Linux kernel entry (no link, no version)
Co-Authored-By: Claude Opus 5.5 <noreply@anthropic.com>
</commit_message>
<xml_diff>
--- a/index.docx
+++ b/index.docx
@@ -553,49 +553,29 @@
         <w:pStyle w:val="Definition"/>
       </w:pPr>
       <w:r>
-        <w:t xml:space="preserve">Contributor to the ext2 filesystem</w:t>
-      </w:r>
-      <w:r>
-        <w:t xml:space="preserve"> </w:t>
-      </w:r>
-      <w:r>
-        <w:t xml:space="preserve">(</w:t>
+        <w:t xml:space="preserve">Contribution to the ext2 filesystem.</w:t>
+      </w:r>
+    </w:p>
+    <w:p>
+      <w:pPr>
+        <w:pStyle w:val="DefinitionTerm"/>
+      </w:pPr>
+      <w:r>
+        <w:t xml:space="preserve">C++</w:t>
+      </w:r>
+    </w:p>
+    <w:p>
+      <w:pPr>
+        <w:pStyle w:val="Compact"/>
+        <w:pStyle w:val="Definition"/>
+      </w:pPr>
+      <w:r>
+        <w:t xml:space="preserve">Author of</w:t>
+      </w:r>
+      <w:r>
+        <w:t xml:space="preserve"> </w:t>
       </w:r>
       <w:hyperlink r:id="rId23">
-        <w:r>
-          <w:rPr>
-            <w:rStyle w:val="Hyperlink"/>
-          </w:rPr>
-          <w:t xml:space="preserve">patch</w:t>
-        </w:r>
-      </w:hyperlink>
-      <w:r>
-        <w:t xml:space="preserve"> </w:t>
-      </w:r>
-      <w:r>
-        <w:t xml:space="preserve">merged in Linux 2.6.33).</w:t>
-      </w:r>
-    </w:p>
-    <w:p>
-      <w:pPr>
-        <w:pStyle w:val="DefinitionTerm"/>
-      </w:pPr>
-      <w:r>
-        <w:t xml:space="preserve">C++</w:t>
-      </w:r>
-    </w:p>
-    <w:p>
-      <w:pPr>
-        <w:pStyle w:val="Compact"/>
-        <w:pStyle w:val="Definition"/>
-      </w:pPr>
-      <w:r>
-        <w:t xml:space="preserve">Author of</w:t>
-      </w:r>
-      <w:r>
-        <w:t xml:space="preserve"> </w:t>
-      </w:r>
-      <w:hyperlink r:id="rId24">
         <w:r>
           <w:rPr>
             <w:rStyle w:val="Hyperlink"/>
@@ -632,7 +612,7 @@
       <w:r>
         <w:t xml:space="preserve"> </w:t>
       </w:r>
-      <w:hyperlink r:id="rId25">
+      <w:hyperlink r:id="rId24">
         <w:r>
           <w:rPr>
             <w:rStyle w:val="Hyperlink"/>
@@ -654,11 +634,11 @@
       <w:pPr>
         <w:pStyle w:val="Heading2"/>
       </w:pPr>
-      <w:bookmarkStart w:id="26" w:name="techs-and-stacks"/>
+      <w:bookmarkStart w:id="25" w:name="techs-and-stacks"/>
       <w:r>
         <w:t xml:space="preserve">Techs and Stacks</w:t>
       </w:r>
-      <w:bookmarkEnd w:id="26"/>
+      <w:bookmarkEnd w:id="25"/>
     </w:p>
     <w:p>
       <w:pPr>
@@ -736,11 +716,11 @@
       <w:pPr>
         <w:pStyle w:val="Heading2"/>
       </w:pPr>
-      <w:bookmarkStart w:id="27" w:name="activities-and-interests"/>
+      <w:bookmarkStart w:id="26" w:name="activities-and-interests"/>
       <w:r>
         <w:t xml:space="preserve">Activities and interests</w:t>
       </w:r>
-      <w:bookmarkEnd w:id="27"/>
+      <w:bookmarkEnd w:id="26"/>
     </w:p>
     <w:p>
       <w:pPr>
@@ -805,7 +785,7 @@
       <w:r>
         <w:br/>
       </w:r>
-      <w:hyperlink r:id="rId28">
+      <w:hyperlink r:id="rId27">
         <w:r>
           <w:rPr>
             <w:rStyle w:val="Hyperlink"/>
@@ -822,7 +802,7 @@
       <w:r>
         <w:t xml:space="preserve"> </w:t>
       </w:r>
-      <w:hyperlink r:id="rId29">
+      <w:hyperlink r:id="rId28">
         <w:r>
           <w:rPr>
             <w:rStyle w:val="Hyperlink"/>
@@ -839,7 +819,7 @@
       <w:r>
         <w:t xml:space="preserve"> </w:t>
       </w:r>
-      <w:hyperlink r:id="rId30">
+      <w:hyperlink r:id="rId29">
         <w:r>
           <w:rPr>
             <w:rStyle w:val="Hyperlink"/>
@@ -856,7 +836,7 @@
       <w:r>
         <w:t xml:space="preserve"> </w:t>
       </w:r>
-      <w:hyperlink r:id="rId31">
+      <w:hyperlink r:id="rId30">
         <w:r>
           <w:rPr>
             <w:rStyle w:val="Hyperlink"/>

</xml_diff>

<commit_message>
Resume: Lisbon contact address instead of Bielsko-Biala
Co-Authored-By: Claude Opus 5.5 <noreply@anthropic.com>
</commit_message>
<xml_diff>
--- a/index.docx
+++ b/index.docx
@@ -774,13 +774,19 @@
         <w:br/>
       </w:r>
       <w:r>
-        <w:t xml:space="preserve">43-300 Bielsko-Biala</w:t>
+        <w:t xml:space="preserve">Rua Correia Teles 28 A</w:t>
       </w:r>
       <w:r>
         <w:br/>
       </w:r>
       <w:r>
-        <w:t xml:space="preserve">Poland</w:t>
+        <w:t xml:space="preserve">1350-100 Lisboa</w:t>
+      </w:r>
+      <w:r>
+        <w:br/>
+      </w:r>
+      <w:r>
+        <w:t xml:space="preserve">Portugal</w:t>
       </w:r>
       <w:r>
         <w:br/>

</xml_diff>